<commit_message>
docs: atualiza documento PIM III com painel professor/admin e RBAC
- RF11-RF15 adicionados: professor (CRUD questões, desempenho alunos),
  admin (stats, CRUD usuários), controle de acesso por papel,
  double-check logout e redirecionamento automático por papel
- Backlog: Sprint 4 expandido com painel professor, painel admin,
  RBAC e double-check
- Banco de dados: DDL atualizado com coluna 'papel' e
  'professor_reino_id' na tabela usuarios; seção 4.4.1 explica
  o controle RBAC com os três papéis e seed automático
- Telas: lista atualizada para 10 telas (professor.html, admin.html),
  organizadas por perfil de acesso (aluno / gestão)
- Integração banco: funções documentadas por domínio (auth, quiz,
  analytics, painel professor, seeds e migração)
- Conclusão: menciona RBAC, painel professor/admin, double-check e
  expande trabalhos futuros com turmas, vínculos e XP configurável
- PIM_III_Tronus.docx regenerado (29 KB)
</commit_message>
<xml_diff>
--- a/PIM_III_Tronus.docx
+++ b/PIM_III_Tronus.docx
@@ -2121,6 +2121,116 @@
     </w:p>
     <w:p>
       <w:pPr>
+        <w:spacing w:after="100"/>
+        <w:ind w:left="720" w:hanging="360"/>
+      </w:pPr>
+      <w:r>
+        <w:rPr>
+          <w:rFonts w:ascii="Arial" w:cs="Arial" w:eastAsia="Arial" w:hAnsi="Arial"/>
+          <w:sz w:val="24"/>
+          <w:szCs w:val="24"/>
+        </w:rPr>
+        <w:t xml:space="preserve">•  </w:t>
+      </w:r>
+      <w:r>
+        <w:rPr>
+          <w:rFonts w:ascii="Arial" w:cs="Arial" w:eastAsia="Arial" w:hAnsi="Arial"/>
+          <w:sz w:val="24"/>
+          <w:szCs w:val="24"/>
+        </w:rPr>
+        <w:t xml:space="preserve">RF11 — O sistema deve disponibilizar painel exclusivo ao professor para criar e excluir questões por fase.</w:t>
+      </w:r>
+    </w:p>
+    <w:p>
+      <w:pPr>
+        <w:spacing w:after="100"/>
+        <w:ind w:left="720" w:hanging="360"/>
+      </w:pPr>
+      <w:r>
+        <w:rPr>
+          <w:rFonts w:ascii="Arial" w:cs="Arial" w:eastAsia="Arial" w:hAnsi="Arial"/>
+          <w:sz w:val="24"/>
+          <w:szCs w:val="24"/>
+        </w:rPr>
+        <w:t xml:space="preserve">•  </w:t>
+      </w:r>
+      <w:r>
+        <w:rPr>
+          <w:rFonts w:ascii="Arial" w:cs="Arial" w:eastAsia="Arial" w:hAnsi="Arial"/>
+          <w:sz w:val="24"/>
+          <w:szCs w:val="24"/>
+        </w:rPr>
+        <w:t xml:space="preserve">RF12 — O sistema deve permitir que o professor busque alunos por nome e visualize o desempenho individual.</w:t>
+      </w:r>
+    </w:p>
+    <w:p>
+      <w:pPr>
+        <w:spacing w:after="100"/>
+        <w:ind w:left="720" w:hanging="360"/>
+      </w:pPr>
+      <w:r>
+        <w:rPr>
+          <w:rFonts w:ascii="Arial" w:cs="Arial" w:eastAsia="Arial" w:hAnsi="Arial"/>
+          <w:sz w:val="24"/>
+          <w:szCs w:val="24"/>
+        </w:rPr>
+        <w:t xml:space="preserve">•  </w:t>
+      </w:r>
+      <w:r>
+        <w:rPr>
+          <w:rFonts w:ascii="Arial" w:cs="Arial" w:eastAsia="Arial" w:hAnsi="Arial"/>
+          <w:sz w:val="24"/>
+          <w:szCs w:val="24"/>
+        </w:rPr>
+        <w:t xml:space="preserve">RF13 — O sistema deve disponibilizar painel exclusivo ao administrador com estatísticas gerais e CRUD de usuários.</w:t>
+      </w:r>
+    </w:p>
+    <w:p>
+      <w:pPr>
+        <w:spacing w:after="100"/>
+        <w:ind w:left="720" w:hanging="360"/>
+      </w:pPr>
+      <w:r>
+        <w:rPr>
+          <w:rFonts w:ascii="Arial" w:cs="Arial" w:eastAsia="Arial" w:hAnsi="Arial"/>
+          <w:sz w:val="24"/>
+          <w:szCs w:val="24"/>
+        </w:rPr>
+        <w:t xml:space="preserve">•  </w:t>
+      </w:r>
+      <w:r>
+        <w:rPr>
+          <w:rFonts w:ascii="Arial" w:cs="Arial" w:eastAsia="Arial" w:hAnsi="Arial"/>
+          <w:sz w:val="24"/>
+          <w:szCs w:val="24"/>
+        </w:rPr>
+        <w:t xml:space="preserve">RF14 — O sistema deve exibir confirmação (double-check) ao usuário antes de efetuar logout.</w:t>
+      </w:r>
+    </w:p>
+    <w:p>
+      <w:pPr>
+        <w:spacing w:after="100"/>
+        <w:ind w:left="720" w:hanging="360"/>
+      </w:pPr>
+      <w:r>
+        <w:rPr>
+          <w:rFonts w:ascii="Arial" w:cs="Arial" w:eastAsia="Arial" w:hAnsi="Arial"/>
+          <w:sz w:val="24"/>
+          <w:szCs w:val="24"/>
+        </w:rPr>
+        <w:t xml:space="preserve">•  </w:t>
+      </w:r>
+      <w:r>
+        <w:rPr>
+          <w:rFonts w:ascii="Arial" w:cs="Arial" w:eastAsia="Arial" w:hAnsi="Arial"/>
+          <w:sz w:val="24"/>
+          <w:szCs w:val="24"/>
+        </w:rPr>
+        <w:t xml:space="preserve">RF15 — O sistema deve redirecionar automaticamente o usuário para a interface correspondente ao seu papel (aluno, professor ou admin) após o login.</w:t>
+      </w:r>
+    </w:p>
+    <w:p>
+      <w:pPr>
         <w:spacing w:after="80"/>
       </w:pPr>
       <w:r>
@@ -2932,38 +3042,38 @@
                 <w:sz w:val="22"/>
                 <w:szCs w:val="22"/>
               </w:rPr>
-              <w:t xml:space="preserve">Should have</w:t>
-            </w:r>
-          </w:p>
-        </w:tc>
-        <w:tc>
-          <w:tcPr>
-            <w:tcBorders>
-              <w:top w:val="single" w:color="888888" w:sz="1"/>
-              <w:left w:val="single" w:color="888888" w:sz="1"/>
-              <w:bottom w:val="single" w:color="888888" w:sz="1"/>
-              <w:right w:val="single" w:color="888888" w:sz="1"/>
-            </w:tcBorders>
-            <w:tcMar>
-              <w:top w:type="dxa" w:w="80"/>
-              <w:left w:type="dxa" w:w="100"/>
-              <w:bottom w:type="dxa" w:w="80"/>
-              <w:right w:type="dxa" w:w="100"/>
-            </w:tcMar>
-          </w:tcPr>
-          <w:p>
-            <w:pPr>
-              <w:jc w:val="left"/>
-            </w:pPr>
-            <w:r>
-              <w:rPr>
-                <w:rFonts w:ascii="Arial" w:cs="Arial" w:eastAsia="Arial" w:hAnsi="Arial"/>
-                <w:b w:val="false"/>
-                <w:bCs w:val="false"/>
-                <w:sz w:val="22"/>
-                <w:szCs w:val="22"/>
-              </w:rPr>
-              <w:t xml:space="preserve">Painel de análise de desempenho</w:t>
+              <w:t xml:space="preserve">Must have</w:t>
+            </w:r>
+          </w:p>
+        </w:tc>
+        <w:tc>
+          <w:tcPr>
+            <w:tcBorders>
+              <w:top w:val="single" w:color="888888" w:sz="1"/>
+              <w:left w:val="single" w:color="888888" w:sz="1"/>
+              <w:bottom w:val="single" w:color="888888" w:sz="1"/>
+              <w:right w:val="single" w:color="888888" w:sz="1"/>
+            </w:tcBorders>
+            <w:tcMar>
+              <w:top w:type="dxa" w:w="80"/>
+              <w:left w:type="dxa" w:w="100"/>
+              <w:bottom w:type="dxa" w:w="80"/>
+              <w:right w:type="dxa" w:w="100"/>
+            </w:tcMar>
+          </w:tcPr>
+          <w:p>
+            <w:pPr>
+              <w:jc w:val="left"/>
+            </w:pPr>
+            <w:r>
+              <w:rPr>
+                <w:rFonts w:ascii="Arial" w:cs="Arial" w:eastAsia="Arial" w:hAnsi="Arial"/>
+                <w:b w:val="false"/>
+                <w:bCs w:val="false"/>
+                <w:sz w:val="22"/>
+                <w:szCs w:val="22"/>
+              </w:rPr>
+              <w:t xml:space="preserve">Questões Python no estilo ENADE (5 por fase)</w:t>
             </w:r>
           </w:p>
         </w:tc>
@@ -3058,7 +3168,7 @@
                 <w:sz w:val="22"/>
                 <w:szCs w:val="22"/>
               </w:rPr>
-              <w:t xml:space="preserve">Tema dark/light</w:t>
+              <w:t xml:space="preserve">Painel de análise de desempenho (dashboard)</w:t>
             </w:r>
           </w:p>
         </w:tc>
@@ -3153,38 +3263,38 @@
                 <w:sz w:val="22"/>
                 <w:szCs w:val="22"/>
               </w:rPr>
-              <w:t xml:space="preserve">Glossário LIBRAS</w:t>
-            </w:r>
-          </w:p>
-        </w:tc>
-        <w:tc>
-          <w:tcPr>
-            <w:tcBorders>
-              <w:top w:val="single" w:color="888888" w:sz="1"/>
-              <w:left w:val="single" w:color="888888" w:sz="1"/>
-              <w:bottom w:val="single" w:color="888888" w:sz="1"/>
-              <w:right w:val="single" w:color="888888" w:sz="1"/>
-            </w:tcBorders>
-            <w:tcMar>
-              <w:top w:type="dxa" w:w="80"/>
-              <w:left w:type="dxa" w:w="100"/>
-              <w:bottom w:type="dxa" w:w="80"/>
-              <w:right w:type="dxa" w:w="100"/>
-            </w:tcMar>
-          </w:tcPr>
-          <w:p>
-            <w:pPr>
-              <w:jc w:val="left"/>
-            </w:pPr>
-            <w:r>
-              <w:rPr>
-                <w:rFonts w:ascii="Arial" w:cs="Arial" w:eastAsia="Arial" w:hAnsi="Arial"/>
-                <w:b w:val="false"/>
-                <w:bCs w:val="false"/>
-                <w:sz w:val="22"/>
-                <w:szCs w:val="22"/>
-              </w:rPr>
-              <w:t xml:space="preserve">Sprint 4</w:t>
+              <w:t xml:space="preserve">Tema dark/light</w:t>
+            </w:r>
+          </w:p>
+        </w:tc>
+        <w:tc>
+          <w:tcPr>
+            <w:tcBorders>
+              <w:top w:val="single" w:color="888888" w:sz="1"/>
+              <w:left w:val="single" w:color="888888" w:sz="1"/>
+              <w:bottom w:val="single" w:color="888888" w:sz="1"/>
+              <w:right w:val="single" w:color="888888" w:sz="1"/>
+            </w:tcBorders>
+            <w:tcMar>
+              <w:top w:type="dxa" w:w="80"/>
+              <w:left w:type="dxa" w:w="100"/>
+              <w:bottom w:type="dxa" w:w="80"/>
+              <w:right w:type="dxa" w:w="100"/>
+            </w:tcMar>
+          </w:tcPr>
+          <w:p>
+            <w:pPr>
+              <w:jc w:val="left"/>
+            </w:pPr>
+            <w:r>
+              <w:rPr>
+                <w:rFonts w:ascii="Arial" w:cs="Arial" w:eastAsia="Arial" w:hAnsi="Arial"/>
+                <w:b w:val="false"/>
+                <w:bCs w:val="false"/>
+                <w:sz w:val="22"/>
+                <w:szCs w:val="22"/>
+              </w:rPr>
+              <w:t xml:space="preserve">Sprint 3</w:t>
             </w:r>
           </w:p>
         </w:tc>
@@ -3217,6 +3327,481 @@
                 <w:sz w:val="22"/>
                 <w:szCs w:val="22"/>
               </w:rPr>
+              <w:t xml:space="preserve">Should have</w:t>
+            </w:r>
+          </w:p>
+        </w:tc>
+        <w:tc>
+          <w:tcPr>
+            <w:tcBorders>
+              <w:top w:val="single" w:color="888888" w:sz="1"/>
+              <w:left w:val="single" w:color="888888" w:sz="1"/>
+              <w:bottom w:val="single" w:color="888888" w:sz="1"/>
+              <w:right w:val="single" w:color="888888" w:sz="1"/>
+            </w:tcBorders>
+            <w:tcMar>
+              <w:top w:type="dxa" w:w="80"/>
+              <w:left w:type="dxa" w:w="100"/>
+              <w:bottom w:type="dxa" w:w="80"/>
+              <w:right w:type="dxa" w:w="100"/>
+            </w:tcMar>
+          </w:tcPr>
+          <w:p>
+            <w:pPr>
+              <w:jc w:val="left"/>
+            </w:pPr>
+            <w:r>
+              <w:rPr>
+                <w:rFonts w:ascii="Arial" w:cs="Arial" w:eastAsia="Arial" w:hAnsi="Arial"/>
+                <w:b w:val="false"/>
+                <w:bCs w:val="false"/>
+                <w:sz w:val="22"/>
+                <w:szCs w:val="22"/>
+              </w:rPr>
+              <w:t xml:space="preserve">Glossário LIBRAS</w:t>
+            </w:r>
+          </w:p>
+        </w:tc>
+        <w:tc>
+          <w:tcPr>
+            <w:tcBorders>
+              <w:top w:val="single" w:color="888888" w:sz="1"/>
+              <w:left w:val="single" w:color="888888" w:sz="1"/>
+              <w:bottom w:val="single" w:color="888888" w:sz="1"/>
+              <w:right w:val="single" w:color="888888" w:sz="1"/>
+            </w:tcBorders>
+            <w:tcMar>
+              <w:top w:type="dxa" w:w="80"/>
+              <w:left w:type="dxa" w:w="100"/>
+              <w:bottom w:type="dxa" w:w="80"/>
+              <w:right w:type="dxa" w:w="100"/>
+            </w:tcMar>
+          </w:tcPr>
+          <w:p>
+            <w:pPr>
+              <w:jc w:val="left"/>
+            </w:pPr>
+            <w:r>
+              <w:rPr>
+                <w:rFonts w:ascii="Arial" w:cs="Arial" w:eastAsia="Arial" w:hAnsi="Arial"/>
+                <w:b w:val="false"/>
+                <w:bCs w:val="false"/>
+                <w:sz w:val="22"/>
+                <w:szCs w:val="22"/>
+              </w:rPr>
+              <w:t xml:space="preserve">Sprint 4</w:t>
+            </w:r>
+          </w:p>
+        </w:tc>
+      </w:tr>
+      <w:tr>
+        <w:tc>
+          <w:tcPr>
+            <w:tcBorders>
+              <w:top w:val="single" w:color="888888" w:sz="1"/>
+              <w:left w:val="single" w:color="888888" w:sz="1"/>
+              <w:bottom w:val="single" w:color="888888" w:sz="1"/>
+              <w:right w:val="single" w:color="888888" w:sz="1"/>
+            </w:tcBorders>
+            <w:tcMar>
+              <w:top w:type="dxa" w:w="80"/>
+              <w:left w:type="dxa" w:w="100"/>
+              <w:bottom w:type="dxa" w:w="80"/>
+              <w:right w:type="dxa" w:w="100"/>
+            </w:tcMar>
+          </w:tcPr>
+          <w:p>
+            <w:pPr>
+              <w:jc w:val="left"/>
+            </w:pPr>
+            <w:r>
+              <w:rPr>
+                <w:rFonts w:ascii="Arial" w:cs="Arial" w:eastAsia="Arial" w:hAnsi="Arial"/>
+                <w:b w:val="false"/>
+                <w:bCs w:val="false"/>
+                <w:sz w:val="22"/>
+                <w:szCs w:val="22"/>
+              </w:rPr>
+              <w:t xml:space="preserve">Should have</w:t>
+            </w:r>
+          </w:p>
+        </w:tc>
+        <w:tc>
+          <w:tcPr>
+            <w:tcBorders>
+              <w:top w:val="single" w:color="888888" w:sz="1"/>
+              <w:left w:val="single" w:color="888888" w:sz="1"/>
+              <w:bottom w:val="single" w:color="888888" w:sz="1"/>
+              <w:right w:val="single" w:color="888888" w:sz="1"/>
+            </w:tcBorders>
+            <w:tcMar>
+              <w:top w:type="dxa" w:w="80"/>
+              <w:left w:type="dxa" w:w="100"/>
+              <w:bottom w:type="dxa" w:w="80"/>
+              <w:right w:type="dxa" w:w="100"/>
+            </w:tcMar>
+          </w:tcPr>
+          <w:p>
+            <w:pPr>
+              <w:jc w:val="left"/>
+            </w:pPr>
+            <w:r>
+              <w:rPr>
+                <w:rFonts w:ascii="Arial" w:cs="Arial" w:eastAsia="Arial" w:hAnsi="Arial"/>
+                <w:b w:val="false"/>
+                <w:bCs w:val="false"/>
+                <w:sz w:val="22"/>
+                <w:szCs w:val="22"/>
+              </w:rPr>
+              <w:t xml:space="preserve">Painel do Professor (CRUD questões, desempenho alunos)</w:t>
+            </w:r>
+          </w:p>
+        </w:tc>
+        <w:tc>
+          <w:tcPr>
+            <w:tcBorders>
+              <w:top w:val="single" w:color="888888" w:sz="1"/>
+              <w:left w:val="single" w:color="888888" w:sz="1"/>
+              <w:bottom w:val="single" w:color="888888" w:sz="1"/>
+              <w:right w:val="single" w:color="888888" w:sz="1"/>
+            </w:tcBorders>
+            <w:tcMar>
+              <w:top w:type="dxa" w:w="80"/>
+              <w:left w:type="dxa" w:w="100"/>
+              <w:bottom w:type="dxa" w:w="80"/>
+              <w:right w:type="dxa" w:w="100"/>
+            </w:tcMar>
+          </w:tcPr>
+          <w:p>
+            <w:pPr>
+              <w:jc w:val="left"/>
+            </w:pPr>
+            <w:r>
+              <w:rPr>
+                <w:rFonts w:ascii="Arial" w:cs="Arial" w:eastAsia="Arial" w:hAnsi="Arial"/>
+                <w:b w:val="false"/>
+                <w:bCs w:val="false"/>
+                <w:sz w:val="22"/>
+                <w:szCs w:val="22"/>
+              </w:rPr>
+              <w:t xml:space="preserve">Sprint 4</w:t>
+            </w:r>
+          </w:p>
+        </w:tc>
+      </w:tr>
+      <w:tr>
+        <w:tc>
+          <w:tcPr>
+            <w:tcBorders>
+              <w:top w:val="single" w:color="888888" w:sz="1"/>
+              <w:left w:val="single" w:color="888888" w:sz="1"/>
+              <w:bottom w:val="single" w:color="888888" w:sz="1"/>
+              <w:right w:val="single" w:color="888888" w:sz="1"/>
+            </w:tcBorders>
+            <w:tcMar>
+              <w:top w:type="dxa" w:w="80"/>
+              <w:left w:type="dxa" w:w="100"/>
+              <w:bottom w:type="dxa" w:w="80"/>
+              <w:right w:type="dxa" w:w="100"/>
+            </w:tcMar>
+          </w:tcPr>
+          <w:p>
+            <w:pPr>
+              <w:jc w:val="left"/>
+            </w:pPr>
+            <w:r>
+              <w:rPr>
+                <w:rFonts w:ascii="Arial" w:cs="Arial" w:eastAsia="Arial" w:hAnsi="Arial"/>
+                <w:b w:val="false"/>
+                <w:bCs w:val="false"/>
+                <w:sz w:val="22"/>
+                <w:szCs w:val="22"/>
+              </w:rPr>
+              <w:t xml:space="preserve">Should have</w:t>
+            </w:r>
+          </w:p>
+        </w:tc>
+        <w:tc>
+          <w:tcPr>
+            <w:tcBorders>
+              <w:top w:val="single" w:color="888888" w:sz="1"/>
+              <w:left w:val="single" w:color="888888" w:sz="1"/>
+              <w:bottom w:val="single" w:color="888888" w:sz="1"/>
+              <w:right w:val="single" w:color="888888" w:sz="1"/>
+            </w:tcBorders>
+            <w:tcMar>
+              <w:top w:type="dxa" w:w="80"/>
+              <w:left w:type="dxa" w:w="100"/>
+              <w:bottom w:type="dxa" w:w="80"/>
+              <w:right w:type="dxa" w:w="100"/>
+            </w:tcMar>
+          </w:tcPr>
+          <w:p>
+            <w:pPr>
+              <w:jc w:val="left"/>
+            </w:pPr>
+            <w:r>
+              <w:rPr>
+                <w:rFonts w:ascii="Arial" w:cs="Arial" w:eastAsia="Arial" w:hAnsi="Arial"/>
+                <w:b w:val="false"/>
+                <w:bCs w:val="false"/>
+                <w:sz w:val="22"/>
+                <w:szCs w:val="22"/>
+              </w:rPr>
+              <w:t xml:space="preserve">Painel do Administrador (stats, CRUD usuários)</w:t>
+            </w:r>
+          </w:p>
+        </w:tc>
+        <w:tc>
+          <w:tcPr>
+            <w:tcBorders>
+              <w:top w:val="single" w:color="888888" w:sz="1"/>
+              <w:left w:val="single" w:color="888888" w:sz="1"/>
+              <w:bottom w:val="single" w:color="888888" w:sz="1"/>
+              <w:right w:val="single" w:color="888888" w:sz="1"/>
+            </w:tcBorders>
+            <w:tcMar>
+              <w:top w:type="dxa" w:w="80"/>
+              <w:left w:type="dxa" w:w="100"/>
+              <w:bottom w:type="dxa" w:w="80"/>
+              <w:right w:type="dxa" w:w="100"/>
+            </w:tcMar>
+          </w:tcPr>
+          <w:p>
+            <w:pPr>
+              <w:jc w:val="left"/>
+            </w:pPr>
+            <w:r>
+              <w:rPr>
+                <w:rFonts w:ascii="Arial" w:cs="Arial" w:eastAsia="Arial" w:hAnsi="Arial"/>
+                <w:b w:val="false"/>
+                <w:bCs w:val="false"/>
+                <w:sz w:val="22"/>
+                <w:szCs w:val="22"/>
+              </w:rPr>
+              <w:t xml:space="preserve">Sprint 4</w:t>
+            </w:r>
+          </w:p>
+        </w:tc>
+      </w:tr>
+      <w:tr>
+        <w:tc>
+          <w:tcPr>
+            <w:tcBorders>
+              <w:top w:val="single" w:color="888888" w:sz="1"/>
+              <w:left w:val="single" w:color="888888" w:sz="1"/>
+              <w:bottom w:val="single" w:color="888888" w:sz="1"/>
+              <w:right w:val="single" w:color="888888" w:sz="1"/>
+            </w:tcBorders>
+            <w:tcMar>
+              <w:top w:type="dxa" w:w="80"/>
+              <w:left w:type="dxa" w:w="100"/>
+              <w:bottom w:type="dxa" w:w="80"/>
+              <w:right w:type="dxa" w:w="100"/>
+            </w:tcMar>
+          </w:tcPr>
+          <w:p>
+            <w:pPr>
+              <w:jc w:val="left"/>
+            </w:pPr>
+            <w:r>
+              <w:rPr>
+                <w:rFonts w:ascii="Arial" w:cs="Arial" w:eastAsia="Arial" w:hAnsi="Arial"/>
+                <w:b w:val="false"/>
+                <w:bCs w:val="false"/>
+                <w:sz w:val="22"/>
+                <w:szCs w:val="22"/>
+              </w:rPr>
+              <w:t xml:space="preserve">Should have</w:t>
+            </w:r>
+          </w:p>
+        </w:tc>
+        <w:tc>
+          <w:tcPr>
+            <w:tcBorders>
+              <w:top w:val="single" w:color="888888" w:sz="1"/>
+              <w:left w:val="single" w:color="888888" w:sz="1"/>
+              <w:bottom w:val="single" w:color="888888" w:sz="1"/>
+              <w:right w:val="single" w:color="888888" w:sz="1"/>
+            </w:tcBorders>
+            <w:tcMar>
+              <w:top w:type="dxa" w:w="80"/>
+              <w:left w:type="dxa" w:w="100"/>
+              <w:bottom w:type="dxa" w:w="80"/>
+              <w:right w:type="dxa" w:w="100"/>
+            </w:tcMar>
+          </w:tcPr>
+          <w:p>
+            <w:pPr>
+              <w:jc w:val="left"/>
+            </w:pPr>
+            <w:r>
+              <w:rPr>
+                <w:rFonts w:ascii="Arial" w:cs="Arial" w:eastAsia="Arial" w:hAnsi="Arial"/>
+                <w:b w:val="false"/>
+                <w:bCs w:val="false"/>
+                <w:sz w:val="22"/>
+                <w:szCs w:val="22"/>
+              </w:rPr>
+              <w:t xml:space="preserve">Controle de acesso por papel (aluno / professor / admin)</w:t>
+            </w:r>
+          </w:p>
+        </w:tc>
+        <w:tc>
+          <w:tcPr>
+            <w:tcBorders>
+              <w:top w:val="single" w:color="888888" w:sz="1"/>
+              <w:left w:val="single" w:color="888888" w:sz="1"/>
+              <w:bottom w:val="single" w:color="888888" w:sz="1"/>
+              <w:right w:val="single" w:color="888888" w:sz="1"/>
+            </w:tcBorders>
+            <w:tcMar>
+              <w:top w:type="dxa" w:w="80"/>
+              <w:left w:type="dxa" w:w="100"/>
+              <w:bottom w:type="dxa" w:w="80"/>
+              <w:right w:type="dxa" w:w="100"/>
+            </w:tcMar>
+          </w:tcPr>
+          <w:p>
+            <w:pPr>
+              <w:jc w:val="left"/>
+            </w:pPr>
+            <w:r>
+              <w:rPr>
+                <w:rFonts w:ascii="Arial" w:cs="Arial" w:eastAsia="Arial" w:hAnsi="Arial"/>
+                <w:b w:val="false"/>
+                <w:bCs w:val="false"/>
+                <w:sz w:val="22"/>
+                <w:szCs w:val="22"/>
+              </w:rPr>
+              <w:t xml:space="preserve">Sprint 4</w:t>
+            </w:r>
+          </w:p>
+        </w:tc>
+      </w:tr>
+      <w:tr>
+        <w:tc>
+          <w:tcPr>
+            <w:tcBorders>
+              <w:top w:val="single" w:color="888888" w:sz="1"/>
+              <w:left w:val="single" w:color="888888" w:sz="1"/>
+              <w:bottom w:val="single" w:color="888888" w:sz="1"/>
+              <w:right w:val="single" w:color="888888" w:sz="1"/>
+            </w:tcBorders>
+            <w:tcMar>
+              <w:top w:type="dxa" w:w="80"/>
+              <w:left w:type="dxa" w:w="100"/>
+              <w:bottom w:type="dxa" w:w="80"/>
+              <w:right w:type="dxa" w:w="100"/>
+            </w:tcMar>
+          </w:tcPr>
+          <w:p>
+            <w:pPr>
+              <w:jc w:val="left"/>
+            </w:pPr>
+            <w:r>
+              <w:rPr>
+                <w:rFonts w:ascii="Arial" w:cs="Arial" w:eastAsia="Arial" w:hAnsi="Arial"/>
+                <w:b w:val="false"/>
+                <w:bCs w:val="false"/>
+                <w:sz w:val="22"/>
+                <w:szCs w:val="22"/>
+              </w:rPr>
+              <w:t xml:space="preserve">Should have</w:t>
+            </w:r>
+          </w:p>
+        </w:tc>
+        <w:tc>
+          <w:tcPr>
+            <w:tcBorders>
+              <w:top w:val="single" w:color="888888" w:sz="1"/>
+              <w:left w:val="single" w:color="888888" w:sz="1"/>
+              <w:bottom w:val="single" w:color="888888" w:sz="1"/>
+              <w:right w:val="single" w:color="888888" w:sz="1"/>
+            </w:tcBorders>
+            <w:tcMar>
+              <w:top w:type="dxa" w:w="80"/>
+              <w:left w:type="dxa" w:w="100"/>
+              <w:bottom w:type="dxa" w:w="80"/>
+              <w:right w:type="dxa" w:w="100"/>
+            </w:tcMar>
+          </w:tcPr>
+          <w:p>
+            <w:pPr>
+              <w:jc w:val="left"/>
+            </w:pPr>
+            <w:r>
+              <w:rPr>
+                <w:rFonts w:ascii="Arial" w:cs="Arial" w:eastAsia="Arial" w:hAnsi="Arial"/>
+                <w:b w:val="false"/>
+                <w:bCs w:val="false"/>
+                <w:sz w:val="22"/>
+                <w:szCs w:val="22"/>
+              </w:rPr>
+              <w:t xml:space="preserve">Double-check de logout</w:t>
+            </w:r>
+          </w:p>
+        </w:tc>
+        <w:tc>
+          <w:tcPr>
+            <w:tcBorders>
+              <w:top w:val="single" w:color="888888" w:sz="1"/>
+              <w:left w:val="single" w:color="888888" w:sz="1"/>
+              <w:bottom w:val="single" w:color="888888" w:sz="1"/>
+              <w:right w:val="single" w:color="888888" w:sz="1"/>
+            </w:tcBorders>
+            <w:tcMar>
+              <w:top w:type="dxa" w:w="80"/>
+              <w:left w:type="dxa" w:w="100"/>
+              <w:bottom w:type="dxa" w:w="80"/>
+              <w:right w:type="dxa" w:w="100"/>
+            </w:tcMar>
+          </w:tcPr>
+          <w:p>
+            <w:pPr>
+              <w:jc w:val="left"/>
+            </w:pPr>
+            <w:r>
+              <w:rPr>
+                <w:rFonts w:ascii="Arial" w:cs="Arial" w:eastAsia="Arial" w:hAnsi="Arial"/>
+                <w:b w:val="false"/>
+                <w:bCs w:val="false"/>
+                <w:sz w:val="22"/>
+                <w:szCs w:val="22"/>
+              </w:rPr>
+              <w:t xml:space="preserve">Sprint 4</w:t>
+            </w:r>
+          </w:p>
+        </w:tc>
+      </w:tr>
+      <w:tr>
+        <w:tc>
+          <w:tcPr>
+            <w:tcBorders>
+              <w:top w:val="single" w:color="888888" w:sz="1"/>
+              <w:left w:val="single" w:color="888888" w:sz="1"/>
+              <w:bottom w:val="single" w:color="888888" w:sz="1"/>
+              <w:right w:val="single" w:color="888888" w:sz="1"/>
+            </w:tcBorders>
+            <w:tcMar>
+              <w:top w:type="dxa" w:w="80"/>
+              <w:left w:type="dxa" w:w="100"/>
+              <w:bottom w:type="dxa" w:w="80"/>
+              <w:right w:type="dxa" w:w="100"/>
+            </w:tcMar>
+          </w:tcPr>
+          <w:p>
+            <w:pPr>
+              <w:jc w:val="left"/>
+            </w:pPr>
+            <w:r>
+              <w:rPr>
+                <w:rFonts w:ascii="Arial" w:cs="Arial" w:eastAsia="Arial" w:hAnsi="Arial"/>
+                <w:b w:val="false"/>
+                <w:bCs w:val="false"/>
+                <w:sz w:val="22"/>
+                <w:szCs w:val="22"/>
+              </w:rPr>
               <w:t xml:space="preserve">Could have</w:t>
             </w:r>
           </w:p>
@@ -3279,7 +3864,7 @@
                 <w:sz w:val="22"/>
                 <w:szCs w:val="22"/>
               </w:rPr>
-              <w:t xml:space="preserve">Sprint 4</w:t>
+              <w:t xml:space="preserve">Sprint 5</w:t>
             </w:r>
           </w:p>
         </w:tc>
@@ -3482,7 +4067,7 @@
           <w:sz w:val="24"/>
           <w:szCs w:val="24"/>
         </w:rPr>
-        <w:t xml:space="preserve">Sprint 3 (Semanas 5–6): Dashboard de análise, tema e progresso persistente. Critério: dados são mantidos após fechar o navegador.</w:t>
+        <w:t xml:space="preserve">Sprint 3 (Semanas 5–6): Dashboard de análise, questões ENADE Python, tema e progresso persistente. Critério: dados são mantidos após fechar o navegador; quiz exibe questões no formato I/II/III/IV com feedback por alternativa.</w:t>
       </w:r>
     </w:p>
     <w:p>
@@ -3504,7 +4089,7 @@
           <w:sz w:val="24"/>
           <w:szCs w:val="24"/>
         </w:rPr>
-        <w:t xml:space="preserve">Sprint 4 (Semanas 7–8): Glossário LIBRAS, responsividade e ajustes finais. Critério: interface funciona em tela de 320 px.</w:t>
+        <w:t xml:space="preserve">Sprint 4 (Semanas 7–8): Painel do professor (CRUD questões, busca de alunos), painel do admin (stats, CRUD usuários), controle de acesso por papel, double-check de logout, glossário LIBRAS e responsividade. Critério: professor consegue criar e excluir questões; admin visualiza estatísticas e exclui usuários; interface funciona em tela de 320 px.</w:t>
       </w:r>
     </w:p>
     <w:p>
@@ -3960,38 +4545,38 @@
                 <w:sz w:val="22"/>
                 <w:szCs w:val="22"/>
               </w:rPr>
-              <w:t xml:space="preserve">id (PK), nome (UNIQUE), email (UNIQUE), celular, senha</w:t>
-            </w:r>
-          </w:p>
-        </w:tc>
-        <w:tc>
-          <w:tcPr>
-            <w:tcBorders>
-              <w:top w:val="single" w:color="888888" w:sz="1"/>
-              <w:left w:val="single" w:color="888888" w:sz="1"/>
-              <w:bottom w:val="single" w:color="888888" w:sz="1"/>
-              <w:right w:val="single" w:color="888888" w:sz="1"/>
-            </w:tcBorders>
-            <w:tcMar>
-              <w:top w:type="dxa" w:w="80"/>
-              <w:left w:type="dxa" w:w="100"/>
-              <w:bottom w:type="dxa" w:w="80"/>
-              <w:right w:type="dxa" w:w="100"/>
-            </w:tcMar>
-          </w:tcPr>
-          <w:p>
-            <w:pPr>
-              <w:jc w:val="left"/>
-            </w:pPr>
-            <w:r>
-              <w:rPr>
-                <w:rFonts w:ascii="Arial" w:cs="Arial" w:eastAsia="Arial" w:hAnsi="Arial"/>
-                <w:b w:val="false"/>
-                <w:bCs w:val="false"/>
-                <w:sz w:val="22"/>
-                <w:szCs w:val="22"/>
-              </w:rPr>
-              <w:t xml:space="preserve">1:1 com personagens</w:t>
+              <w:t xml:space="preserve">id (PK), nome (UNIQUE), email (UNIQUE), celular, senha, papel (aluno|professor|admin), professor_reino_id (FK)</w:t>
+            </w:r>
+          </w:p>
+        </w:tc>
+        <w:tc>
+          <w:tcPr>
+            <w:tcBorders>
+              <w:top w:val="single" w:color="888888" w:sz="1"/>
+              <w:left w:val="single" w:color="888888" w:sz="1"/>
+              <w:bottom w:val="single" w:color="888888" w:sz="1"/>
+              <w:right w:val="single" w:color="888888" w:sz="1"/>
+            </w:tcBorders>
+            <w:tcMar>
+              <w:top w:type="dxa" w:w="80"/>
+              <w:left w:type="dxa" w:w="100"/>
+              <w:bottom w:type="dxa" w:w="80"/>
+              <w:right w:type="dxa" w:w="100"/>
+            </w:tcMar>
+          </w:tcPr>
+          <w:p>
+            <w:pPr>
+              <w:jc w:val="left"/>
+            </w:pPr>
+            <w:r>
+              <w:rPr>
+                <w:rFonts w:ascii="Arial" w:cs="Arial" w:eastAsia="Arial" w:hAnsi="Arial"/>
+                <w:b w:val="false"/>
+                <w:bCs w:val="false"/>
+                <w:sz w:val="22"/>
+                <w:szCs w:val="22"/>
+              </w:rPr>
+              <w:t xml:space="preserve">1:1 com personagens; papel define o nível de acesso</w:t>
             </w:r>
           </w:p>
         </w:tc>
@@ -4698,7 +5283,7 @@
           <w:sz w:val="24"/>
           <w:szCs w:val="24"/>
         </w:rPr>
-        <w:t xml:space="preserve">O banco de dados é criado e gerenciado pela biblioteca sql.js (SQLite compilado em WebAssembly), executado diretamente no navegador. O script de criação das tabelas principais é apresentado a seguir:</w:t>
+        <w:t xml:space="preserve">O banco de dados é criado e gerenciado pela biblioteca sql.js (SQLite compilado em WebAssembly), executado diretamente no navegador. O script DDL das tabelas principais é apresentado a seguir:</w:t>
       </w:r>
     </w:p>
     <w:p>
@@ -4712,7 +5297,16 @@
           <w:sz w:val="18"/>
           <w:szCs w:val="18"/>
         </w:rPr>
-        <w:t xml:space="preserve">CREATE TABLE questoes (
+        <w:t xml:space="preserve">CREATE TABLE usuarios (
+  id INTEGER PRIMARY KEY AUTOINCREMENT,
+  nome TEXT UNIQUE NOT NULL,
+  email TEXT UNIQUE NOT NULL,
+  celular TEXT NOT NULL,
+  senha TEXT NOT NULL,
+  papel TEXT DEFAULT 'aluno',         -- aluno | professor | admin
+  professor_reino_id INTEGER DEFAULT NULL
+);
+CREATE TABLE questoes (
   id INTEGER PRIMARY KEY AUTOINCREMENT,
   fase_id INTEGER NOT NULL,
   enunciado TEXT NOT NULL,
@@ -4747,6 +5341,126 @@
     </w:p>
     <w:p>
       <w:pPr>
+        <w:pStyle w:val="Heading3"/>
+        <w:spacing w:after="60" w:before="200"/>
+      </w:pPr>
+      <w:r>
+        <w:rPr>
+          <w:rFonts w:ascii="Arial" w:cs="Arial" w:eastAsia="Arial" w:hAnsi="Arial"/>
+          <w:b/>
+          <w:bCs/>
+          <w:sz w:val="22"/>
+          <w:szCs w:val="22"/>
+        </w:rPr>
+        <w:t xml:space="preserve">4.4.1 Controle de Acesso por Papel (Role-Based Access Control)</w:t>
+      </w:r>
+    </w:p>
+    <w:p>
+      <w:pPr>
+        <w:spacing w:after="160"/>
+        <w:ind w:firstLine="708"/>
+        <w:jc w:val="both"/>
+      </w:pPr>
+      <w:r>
+        <w:rPr>
+          <w:rFonts w:ascii="Arial" w:cs="Arial" w:eastAsia="Arial" w:hAnsi="Arial"/>
+          <w:sz w:val="24"/>
+          <w:szCs w:val="24"/>
+        </w:rPr>
+        <w:t xml:space="preserve">A coluna papel na tabela usuarios implementa um controle de acesso baseado em papéis (RBAC). Três papéis estão definidos:</w:t>
+      </w:r>
+    </w:p>
+    <w:p>
+      <w:pPr>
+        <w:spacing w:after="100"/>
+        <w:ind w:left="720" w:hanging="360"/>
+      </w:pPr>
+      <w:r>
+        <w:rPr>
+          <w:rFonts w:ascii="Arial" w:cs="Arial" w:eastAsia="Arial" w:hAnsi="Arial"/>
+          <w:sz w:val="24"/>
+          <w:szCs w:val="24"/>
+        </w:rPr>
+        <w:t xml:space="preserve">•  </w:t>
+      </w:r>
+      <w:r>
+        <w:rPr>
+          <w:rFonts w:ascii="Arial" w:cs="Arial" w:eastAsia="Arial" w:hAnsi="Arial"/>
+          <w:sz w:val="24"/>
+          <w:szCs w:val="24"/>
+        </w:rPr>
+        <w:t xml:space="preserve">aluno — acesso ao fluxo de jogo (reinos, trilha, quiz, dashboard pessoal). Criado automaticamente no cadastro.</w:t>
+      </w:r>
+    </w:p>
+    <w:p>
+      <w:pPr>
+        <w:spacing w:after="100"/>
+        <w:ind w:left="720" w:hanging="360"/>
+      </w:pPr>
+      <w:r>
+        <w:rPr>
+          <w:rFonts w:ascii="Arial" w:cs="Arial" w:eastAsia="Arial" w:hAnsi="Arial"/>
+          <w:sz w:val="24"/>
+          <w:szCs w:val="24"/>
+        </w:rPr>
+        <w:t xml:space="preserve">•  </w:t>
+      </w:r>
+      <w:r>
+        <w:rPr>
+          <w:rFonts w:ascii="Arial" w:cs="Arial" w:eastAsia="Arial" w:hAnsi="Arial"/>
+          <w:sz w:val="24"/>
+          <w:szCs w:val="24"/>
+        </w:rPr>
+        <w:t xml:space="preserve">professor — acesso ao painel do professor (professor.html): criar/excluir questões por fase, visualizar desempenho de alunos por nome. Vinculado a um reino via professor_reino_id.</w:t>
+      </w:r>
+    </w:p>
+    <w:p>
+      <w:pPr>
+        <w:spacing w:after="100"/>
+        <w:ind w:left="720" w:hanging="360"/>
+      </w:pPr>
+      <w:r>
+        <w:rPr>
+          <w:rFonts w:ascii="Arial" w:cs="Arial" w:eastAsia="Arial" w:hAnsi="Arial"/>
+          <w:sz w:val="24"/>
+          <w:szCs w:val="24"/>
+        </w:rPr>
+        <w:t xml:space="preserve">•  </w:t>
+      </w:r>
+      <w:r>
+        <w:rPr>
+          <w:rFonts w:ascii="Arial" w:cs="Arial" w:eastAsia="Arial" w:hAnsi="Arial"/>
+          <w:sz w:val="24"/>
+          <w:szCs w:val="24"/>
+        </w:rPr>
+        <w:t xml:space="preserve">admin — acesso ao painel administrativo (admin.html): estatísticas gerais do sistema, listagem e exclusão de usuários.</w:t>
+      </w:r>
+    </w:p>
+    <w:p>
+      <w:pPr>
+        <w:spacing w:after="160"/>
+        <w:ind w:firstLine="708"/>
+        <w:jc w:val="both"/>
+      </w:pPr>
+      <w:r>
+        <w:rPr>
+          <w:rFonts w:ascii="Arial" w:cs="Arial" w:eastAsia="Arial" w:hAnsi="Arial"/>
+          <w:sz w:val="24"/>
+          <w:szCs w:val="24"/>
+        </w:rPr>
+        <w:t xml:space="preserve">Ao efetuar login, o sistema verifica o campo papel e redireciona automaticamente: alunos para reinos.html, professores para professor.html e administradores para admin.html. Dois usuários especiais são criados automaticamente na inicialização do banco — prof_python (professor do Reino Python) e admin — cujas credenciais estão documentadas no arquivo LOGINS.md do repositório.</w:t>
+      </w:r>
+    </w:p>
+    <w:p>
+      <w:pPr>
+        <w:spacing w:after="80"/>
+      </w:pPr>
+      <w:r>
+        <w:t xml:space="preserve"/>
+      </w:r>
+    </w:p>
+    <w:p>
+      <w:pPr>
         <w:pStyle w:val="Heading2"/>
         <w:spacing w:after="80" w:before="280"/>
       </w:pPr>
@@ -5682,7 +6396,23 @@
           <w:sz w:val="24"/>
           <w:szCs w:val="24"/>
         </w:rPr>
-        <w:t xml:space="preserve">O sistema é composto por sete telas principais:</w:t>
+        <w:t xml:space="preserve">O sistema é composto por dez telas, organizadas por perfil de acesso:</w:t>
+      </w:r>
+    </w:p>
+    <w:p>
+      <w:pPr>
+        <w:pStyle w:val="Heading3"/>
+        <w:spacing w:after="60" w:before="200"/>
+      </w:pPr>
+      <w:r>
+        <w:rPr>
+          <w:rFonts w:ascii="Arial" w:cs="Arial" w:eastAsia="Arial" w:hAnsi="Arial"/>
+          <w:b/>
+          <w:bCs/>
+          <w:sz w:val="22"/>
+          <w:szCs w:val="22"/>
+        </w:rPr>
+        <w:t xml:space="preserve">5.2.1 Telas do Aluno</w:t>
       </w:r>
     </w:p>
     <w:p>
@@ -5726,7 +6456,7 @@
           <w:sz w:val="24"/>
           <w:szCs w:val="24"/>
         </w:rPr>
-        <w:t xml:space="preserve">index.html — Tela de login com suporte a nome de usuário ou e-mail.</w:t>
+        <w:t xml:space="preserve">index.html — Tela de login com suporte a nome de usuário ou e-mail e redirecionamento por papel.</w:t>
       </w:r>
     </w:p>
     <w:p>
@@ -5748,7 +6478,7 @@
           <w:sz w:val="24"/>
           <w:szCs w:val="24"/>
         </w:rPr>
-        <w:t xml:space="preserve">register.html — Cadastro de novo usuário.</w:t>
+        <w:t xml:space="preserve">register.html — Cadastro de novo usuário (papel 'aluno' atribuído por padrão).</w:t>
       </w:r>
     </w:p>
     <w:p>
@@ -5836,7 +6566,7 @@
           <w:sz w:val="24"/>
           <w:szCs w:val="24"/>
         </w:rPr>
-        <w:t xml:space="preserve">trilha.html — Trilha de fases com quiz interativo, cards de atividades e painel LIBRAS.</w:t>
+        <w:t xml:space="preserve">trilha.html — Trilha de fases com quiz interativo (estilo ENADE), cards de atividades e botão de acessibilidade LIBRAS.</w:t>
       </w:r>
     </w:p>
     <w:p>
@@ -5858,7 +6588,75 @@
           <w:sz w:val="24"/>
           <w:szCs w:val="24"/>
         </w:rPr>
-        <w:t xml:space="preserve">dashboard.html — Análise de desempenho com gráficos e tabela detalhada.</w:t>
+        <w:t xml:space="preserve">dashboard.html — Painel de análise de desempenho individual com gráfico por reino e tabela detalhada por fase.</w:t>
+      </w:r>
+    </w:p>
+    <w:p>
+      <w:pPr>
+        <w:spacing w:after="80"/>
+      </w:pPr>
+      <w:r>
+        <w:t xml:space="preserve"/>
+      </w:r>
+    </w:p>
+    <w:p>
+      <w:pPr>
+        <w:pStyle w:val="Heading3"/>
+        <w:spacing w:after="60" w:before="200"/>
+      </w:pPr>
+      <w:r>
+        <w:rPr>
+          <w:rFonts w:ascii="Arial" w:cs="Arial" w:eastAsia="Arial" w:hAnsi="Arial"/>
+          <w:b/>
+          <w:bCs/>
+          <w:sz w:val="22"/>
+          <w:szCs w:val="22"/>
+        </w:rPr>
+        <w:t xml:space="preserve">5.2.2 Telas de Gestão</w:t>
+      </w:r>
+    </w:p>
+    <w:p>
+      <w:pPr>
+        <w:spacing w:after="100"/>
+        <w:ind w:left="720" w:hanging="360"/>
+      </w:pPr>
+      <w:r>
+        <w:rPr>
+          <w:rFonts w:ascii="Arial" w:cs="Arial" w:eastAsia="Arial" w:hAnsi="Arial"/>
+          <w:sz w:val="24"/>
+          <w:szCs w:val="24"/>
+        </w:rPr>
+        <w:t xml:space="preserve">•  </w:t>
+      </w:r>
+      <w:r>
+        <w:rPr>
+          <w:rFonts w:ascii="Arial" w:cs="Arial" w:eastAsia="Arial" w:hAnsi="Arial"/>
+          <w:sz w:val="24"/>
+          <w:szCs w:val="24"/>
+        </w:rPr>
+        <w:t xml:space="preserve">professor.html — Painel do Professor: aba 'Questões' (criar/excluir questões por fase) e aba 'Alunos' (busca por nome e visualização de desempenho individual expandível).</w:t>
+      </w:r>
+    </w:p>
+    <w:p>
+      <w:pPr>
+        <w:spacing w:after="100"/>
+        <w:ind w:left="720" w:hanging="360"/>
+      </w:pPr>
+      <w:r>
+        <w:rPr>
+          <w:rFonts w:ascii="Arial" w:cs="Arial" w:eastAsia="Arial" w:hAnsi="Arial"/>
+          <w:sz w:val="24"/>
+          <w:szCs w:val="24"/>
+        </w:rPr>
+        <w:t xml:space="preserve">•  </w:t>
+      </w:r>
+      <w:r>
+        <w:rPr>
+          <w:rFonts w:ascii="Arial" w:cs="Arial" w:eastAsia="Arial" w:hAnsi="Arial"/>
+          <w:sz w:val="24"/>
+          <w:szCs w:val="24"/>
+        </w:rPr>
+        <w:t xml:space="preserve">admin.html — Painel do Administrador: estatísticas gerais do sistema (usuários, questões, respostas), listagem completa de usuários com exclusão e módulos futuros sinalizados.</w:t>
       </w:r>
     </w:p>
     <w:p>
@@ -6031,7 +6829,154 @@
           <w:sz w:val="24"/>
           <w:szCs w:val="24"/>
         </w:rPr>
-        <w:t xml:space="preserve">A integração entre a camada de apresentação e o banco de dados é feita diretamente em JavaScript. O arquivo js/database.js centraliza todas as funções de acesso ao banco: cadastrarUsuario(), loginUsuario(), buscarQuestoesPorFase(), registrarResposta(), buscarEstatisticas(), entre outras. Cada tela importa este arquivo e chama as funções necessárias após a inicialização assíncrona do banco (initDatabase()).</w:t>
+        <w:t xml:space="preserve">A integração entre a camada de apresentação e o banco de dados é feita diretamente em JavaScript. O arquivo js/database.js centraliza todas as funções de acesso ao banco, organizadas por domínio:</w:t>
+      </w:r>
+    </w:p>
+    <w:p>
+      <w:pPr>
+        <w:spacing w:after="100"/>
+        <w:ind w:left="720" w:hanging="360"/>
+      </w:pPr>
+      <w:r>
+        <w:rPr>
+          <w:rFonts w:ascii="Arial" w:cs="Arial" w:eastAsia="Arial" w:hAnsi="Arial"/>
+          <w:sz w:val="24"/>
+          <w:szCs w:val="24"/>
+        </w:rPr>
+        <w:t xml:space="preserve">•  </w:t>
+      </w:r>
+      <w:r>
+        <w:rPr>
+          <w:rFonts w:ascii="Arial" w:cs="Arial" w:eastAsia="Arial" w:hAnsi="Arial"/>
+          <w:sz w:val="24"/>
+          <w:szCs w:val="24"/>
+        </w:rPr>
+        <w:t xml:space="preserve">Autenticação: cadastrarUsuario(), loginUsuario(), redefinirSenha().</w:t>
+      </w:r>
+    </w:p>
+    <w:p>
+      <w:pPr>
+        <w:spacing w:after="100"/>
+        <w:ind w:left="720" w:hanging="360"/>
+      </w:pPr>
+      <w:r>
+        <w:rPr>
+          <w:rFonts w:ascii="Arial" w:cs="Arial" w:eastAsia="Arial" w:hAnsi="Arial"/>
+          <w:sz w:val="24"/>
+          <w:szCs w:val="24"/>
+        </w:rPr>
+        <w:t xml:space="preserve">•  </w:t>
+      </w:r>
+      <w:r>
+        <w:rPr>
+          <w:rFonts w:ascii="Arial" w:cs="Arial" w:eastAsia="Arial" w:hAnsi="Arial"/>
+          <w:sz w:val="24"/>
+          <w:szCs w:val="24"/>
+        </w:rPr>
+        <w:t xml:space="preserve">Personagem e progresso: salvarPersonagem(), buscarPersonagem(), atualizarProgresso(), atualizarTitulo().</w:t>
+      </w:r>
+    </w:p>
+    <w:p>
+      <w:pPr>
+        <w:spacing w:after="100"/>
+        <w:ind w:left="720" w:hanging="360"/>
+      </w:pPr>
+      <w:r>
+        <w:rPr>
+          <w:rFonts w:ascii="Arial" w:cs="Arial" w:eastAsia="Arial" w:hAnsi="Arial"/>
+          <w:sz w:val="24"/>
+          <w:szCs w:val="24"/>
+        </w:rPr>
+        <w:t xml:space="preserve">•  </w:t>
+      </w:r>
+      <w:r>
+        <w:rPr>
+          <w:rFonts w:ascii="Arial" w:cs="Arial" w:eastAsia="Arial" w:hAnsi="Arial"/>
+          <w:sz w:val="24"/>
+          <w:szCs w:val="24"/>
+        </w:rPr>
+        <w:t xml:space="preserve">Quiz: buscarQuestoesPorFase(), registrarResposta().</w:t>
+      </w:r>
+    </w:p>
+    <w:p>
+      <w:pPr>
+        <w:spacing w:after="100"/>
+        <w:ind w:left="720" w:hanging="360"/>
+      </w:pPr>
+      <w:r>
+        <w:rPr>
+          <w:rFonts w:ascii="Arial" w:cs="Arial" w:eastAsia="Arial" w:hAnsi="Arial"/>
+          <w:sz w:val="24"/>
+          <w:szCs w:val="24"/>
+        </w:rPr>
+        <w:t xml:space="preserve">•  </w:t>
+      </w:r>
+      <w:r>
+        <w:rPr>
+          <w:rFonts w:ascii="Arial" w:cs="Arial" w:eastAsia="Arial" w:hAnsi="Arial"/>
+          <w:sz w:val="24"/>
+          <w:szCs w:val="24"/>
+        </w:rPr>
+        <w:t xml:space="preserve">Analytics: buscarEstatisticas(), buscarResumoGeral().</w:t>
+      </w:r>
+    </w:p>
+    <w:p>
+      <w:pPr>
+        <w:spacing w:after="100"/>
+        <w:ind w:left="720" w:hanging="360"/>
+      </w:pPr>
+      <w:r>
+        <w:rPr>
+          <w:rFonts w:ascii="Arial" w:cs="Arial" w:eastAsia="Arial" w:hAnsi="Arial"/>
+          <w:sz w:val="24"/>
+          <w:szCs w:val="24"/>
+        </w:rPr>
+        <w:t xml:space="preserve">•  </w:t>
+      </w:r>
+      <w:r>
+        <w:rPr>
+          <w:rFonts w:ascii="Arial" w:cs="Arial" w:eastAsia="Arial" w:hAnsi="Arial"/>
+          <w:sz w:val="24"/>
+          <w:szCs w:val="24"/>
+        </w:rPr>
+        <w:t xml:space="preserve">Painel do professor: criarQuestao(), excluirQuestao(), listarQuestoesDaFase(), buscarAlunosPorNome(), buscarDesempenhoAluno(), buscarFasesPorReino().</w:t>
+      </w:r>
+    </w:p>
+    <w:p>
+      <w:pPr>
+        <w:spacing w:after="100"/>
+        <w:ind w:left="720" w:hanging="360"/>
+      </w:pPr>
+      <w:r>
+        <w:rPr>
+          <w:rFonts w:ascii="Arial" w:cs="Arial" w:eastAsia="Arial" w:hAnsi="Arial"/>
+          <w:sz w:val="24"/>
+          <w:szCs w:val="24"/>
+        </w:rPr>
+        <w:t xml:space="preserve">•  </w:t>
+      </w:r>
+      <w:r>
+        <w:rPr>
+          <w:rFonts w:ascii="Arial" w:cs="Arial" w:eastAsia="Arial" w:hAnsi="Arial"/>
+          <w:sz w:val="24"/>
+          <w:szCs w:val="24"/>
+        </w:rPr>
+        <w:t xml:space="preserve">Seeds e migração: seedReinos(), seedQuestoes(), seedUsuariosEspeciais(), migrateDatabase() — garante compatibilidade com bancos já existentes no localStorage sem perda de dados.</w:t>
+      </w:r>
+    </w:p>
+    <w:p>
+      <w:pPr>
+        <w:spacing w:after="160"/>
+        <w:ind w:firstLine="708"/>
+        <w:jc w:val="both"/>
+      </w:pPr>
+      <w:r>
+        <w:rPr>
+          <w:rFonts w:ascii="Arial" w:cs="Arial" w:eastAsia="Arial" w:hAnsi="Arial"/>
+          <w:sz w:val="24"/>
+          <w:szCs w:val="24"/>
+        </w:rPr>
+        <w:t xml:space="preserve">Cada tela importa este arquivo e chama as funções necessárias após a inicialização assíncrona do banco via initDatabase(). A função migrateDatabase() aplica ALTER TABLE de forma idempotente (try/catch), permitindo que usuários com versões antigas do banco recebam as novas colunas automaticamente na próxima visita.</w:t>
       </w:r>
     </w:p>
     <w:p>
@@ -8722,7 +9667,7 @@
           <w:sz w:val="24"/>
           <w:szCs w:val="24"/>
         </w:rPr>
-        <w:t xml:space="preserve">Do ponto de vista técnico, a escolha por tecnologias web puras (HTML5, CSS3, JavaScript) e banco de dados SQLite embarcado (sql.js) permitiu a entrega de uma aplicação sem dependência de servidores, com boa usabilidade e responsividade. O sistema de quiz com questões no estilo ENADE, combinado ao painel de análise de desempenho, cumpre o objetivo central da plataforma: transformar a interação do estudante em dados acionáveis para o seu desenvolvimento.</w:t>
+        <w:t xml:space="preserve">Do ponto de vista técnico, a escolha por tecnologias web puras (HTML5, CSS3, JavaScript) e banco de dados SQLite embarcado (sql.js) permitiu a entrega de uma aplicação sem dependência de servidores, com boa usabilidade e responsividade. O sistema de quiz com questões no estilo ENADE — com enunciados compostos por afirmativas I, II, III e IV — combinado ao painel de análise de desempenho, cumpre o objetivo central da plataforma: transformar a interação do estudante em dados acionáveis para o seu desenvolvimento.</w:t>
       </w:r>
     </w:p>
     <w:p>
@@ -8737,7 +9682,7 @@
           <w:sz w:val="24"/>
           <w:szCs w:val="24"/>
         </w:rPr>
-        <w:t xml:space="preserve">Os indicadores de análise implementados — taxa de acerto por fase e reino, gráfico de barras e tabela detalhada — oferecem ao estudante uma visão clara de seus pontos fortes e das áreas que demandam revisão. A incorporação do glossário de LIBRAS representa um passo concreto em direção à acessibilidade digital, alinhada à legislação brasileira e aos princípios de inclusão.</w:t>
+        <w:t xml:space="preserve">O controle de acesso por papéis (RBAC) diferencia três perfis: aluno, professor e administrador. O painel do professor permite gerenciar questões por fase e acompanhar o desempenho individual dos alunos por busca nominal. O painel do administrador oferece visibilidade sobre as estatísticas gerais do sistema e o gerenciamento de usuários. Ambos os perfis especiais são pré-cadastrados automaticamente na inicialização do banco, com credenciais documentadas.</w:t>
       </w:r>
     </w:p>
     <w:p>
@@ -8752,7 +9697,22 @@
           <w:sz w:val="24"/>
           <w:szCs w:val="24"/>
         </w:rPr>
-        <w:t xml:space="preserve">Como trabalhos futuros, a equipe propõe: (i) implementação de backend com Node.js e banco de dados centralizado para suporte a múltiplos dispositivos; (ii) expansão do banco de questões para todos os reinos; (iii) desenvolvimento do módulo de Machine Learning para recomendação personalizada de conteúdo; e (iv) incorporação de vídeos de LIBRAS nos enunciados das questões.</w:t>
+        <w:t xml:space="preserve">Os indicadores de análise implementados — taxa de acerto por fase e reino, gráfico de barras por reino e tabela detalhada — oferecem ao estudante uma visão clara de seus pontos fortes e das áreas que demandam revisão. A incorporação do glossário de LIBRAS representa um passo concreto em direção à acessibilidade digital, alinhada à legislação brasileira e aos princípios de inclusão. O double-check de logout e o redirecionamento inteligente por papel reforçam a qualidade da experiência do usuário.</w:t>
+      </w:r>
+    </w:p>
+    <w:p>
+      <w:pPr>
+        <w:spacing w:after="160"/>
+        <w:ind w:firstLine="708"/>
+        <w:jc w:val="both"/>
+      </w:pPr>
+      <w:r>
+        <w:rPr>
+          <w:rFonts w:ascii="Arial" w:cs="Arial" w:eastAsia="Arial" w:hAnsi="Arial"/>
+          <w:sz w:val="24"/>
+          <w:szCs w:val="24"/>
+        </w:rPr>
+        <w:t xml:space="preserve">Como trabalhos futuros, a equipe propõe: (i) implementação de backend com Node.js e banco de dados centralizado para suporte a múltiplos dispositivos e turmas; (ii) expansão do banco de questões para todos os reinos (C++, Engenharia de Software, Banco de Dados, Redes); (iii) módulo completo de administração de turmas, vínculos professor–turma e regras de XP configuráveis; (iv) desenvolvimento do módulo de Machine Learning para recomendação personalizada de conteúdo; e (v) incorporação de vídeos de LIBRAS nos enunciados das questões.</w:t>
       </w:r>
     </w:p>
     <w:p>

</xml_diff>